<commit_message>
docs(legal): Aswatax referral fee capped at 24 months, audit clause removed (owner edit 27 Aug)
Co-Authored-By: Claude Fable 5 <noreply@anthropic.com>
Claude-Session: https://claude.ai/code/session_011QCkdwLEnh5WJiMsNyG2KP
</commit_message>
<xml_diff>
--- a/legal/aswatax/Referral_Agreement_Aswatax.docx
+++ b/legal/aswatax/Referral_Agreement_Aswatax.docx
@@ -74,7 +74,7 @@
     <w:p>
       <w:r>
         <w:rPr/>
-        <w:t>(C) The Adviser will pay the Introducer a fee of 20 per cent of the Advisory Fees it bills each Referred Client, for as long as it acts for that client.</w:t>
+        <w:t>(C) The Adviser will pay the Introducer a fee of 20 per cent of the Advisory Fees it bills each Referred Client, for 24 months from the date of that client's Referral.</w:t>
       </w:r>
     </w:p>
     <w:p>
@@ -206,7 +206,7 @@
     <w:p>
       <w:r>
         <w:rPr/>
-        <w:t>4.1 The Adviser will pay the Introducer the Referral Fee on all Advisory Fees billed to each Referred Client, for as long as the Adviser (or any successor practice of the Adviser) acts for that Referred Client. This obligation survives termination of this agreement in respect of every person who became a Referred Client before termination.</w:t>
+        <w:t>4.1 The Adviser will pay the Introducer the Referral Fee on all Advisory Fees billed to each Referred Client for a period of 24 months from the date of the Referral of that Referred Client. This obligation survives termination of this agreement in respect of every person who became a Referred Client before termination, until the end of that 24 month period.</w:t>
       </w:r>
     </w:p>
     <w:p>
@@ -224,13 +224,7 @@
     <w:p>
       <w:r>
         <w:rPr/>
-        <w:t>4.4 On reasonable notice, no more than twice a year, the Adviser will provide reasonable supporting information to verify the statements, limited to fee and billing records for Referred Clients. The Introducer will keep that information confidential and use it only for verification.</w:t>
-      </w:r>
-    </w:p>
-    <w:p>
-      <w:r>
-        <w:rPr/>
-        <w:t>4.5 If the Adviser writes off or credits an Advisory Fee on which a Referral Fee was paid, the corresponding Referral Fee is credited against the next statement.</w:t>
+        <w:t>4.4 If the Adviser writes off or credits an Advisory Fee on which a Referral Fee was paid, the corresponding Referral Fee is credited against the next statement.</w:t>
       </w:r>
     </w:p>
     <w:p>
@@ -522,7 +516,7 @@
             </w:pPr>
             <w:r>
               <w:rPr/>
-              <w:t>Date: 26 August 2026</w:t>
+              <w:t>Date: 27 August 2026</w:t>
             </w:r>
           </w:p>
         </w:tc>

</xml_diff>